<commit_message>
Informe final: institución (Universidad Santo Tomás) y sin afirmaciones de contexto sin fuente (DEC-045)
Co-Authored-By: Claude Opus 5.5 <noreply@anthropic.com>
</commit_message>
<xml_diff>
--- a/informes/informe_final.docx
+++ b/informes/informe_final.docx
@@ -59,7 +59,7 @@
           <w:sz w:val="26"/>
           <w:szCs w:val="26"/>
         </w:rPr>
-        <w:t xml:space="preserve"> [Institución]</w:t>
+        <w:t xml:space="preserve"> Universidad Santo Tomás</w:t>
       </w:r>
     </w:p>
     <w:p>
@@ -11015,7 +11015,7 @@
         <w:t xml:space="preserve">Contexto.</w:t>
       </w:r>
       <w:r>
-        <w:t xml:space="preserve"> El IBR pasó de 1,6 % (marzo de 2021) a 12,4 % (mayo de 2023). El 1/N rindió −4,0 % anual en 2021–2023 y +29,6 %, +55,8 % y +39,9 % en 2024, 2025 y 2026. La relación entre el ciclo de tasas y el desempeño de la renta variable se presenta como hipótesis [requiere respaldo con fuentes].</w:t>
+        <w:t xml:space="preserve"> El IBR pasó de 1,6 % (marzo de 2021) a 12,4 % (mayo de 2023). El 1/N rindió −4,0 % anual en 2021–2023 y +29,6 %, +55,8 % y +39,9 % en 2024, 2025 y 2026. Estas cifras describen el periodo; el proyecto no evaluó qué factores explican esos cambios.</w:t>
       </w:r>
     </w:p>
     <w:p>

</xml_diff>